<commit_message>
제1–4본 2026-10-09 최종 DOCX와 제4본 Markdown 반영
- 제1·2본 DOCX 추가, 제3·4본 DOCX를 최종본으로 교체(본문 텍스트가 최종 PDF와 일치)
- 제4본 Markdown을 최종 DOCX에서 pandoc으로 다시 생성
- INDEX·README·상태 보고서·교정 기록의 편집 원본 안내 갱신
- 제1·2본 DOCX의 출처(최초 원고 여부)는 미확인으로 명시, 체크섬 재계산

Co-Authored-By: Claude Opus 5.5 <noreply@anthropic.com>
Claude-Session: https://claude.ai/code/session_01Q9a9ZgRMnLzpvNNQ2mFpmL
</commit_message>
<xml_diff>
--- a/docs/HMBR_Book4_Guhyeonbon_20261009.docx
+++ b/docs/HMBR_Book4_Guhyeonbon_20261009.docx
@@ -394,7 +394,7 @@
     </w:p>
     <w:p>
       <w:r>
-        <w:t>이 개정은 2026-08-07 제4본의 12개 장과 부록 A·B를 계승한다. 설명과 예시는 2026-09-08 제1·2본 교정본, 46쪽 제3본 개정 초안 및 같은 날의 새 웹앱에 맞췄다. 구판의 규칙이나 시험 수치를 최신 구현의 사실로 옮기지 않는다.</w:t>
+        <w:t>이 책은 2026-08-07 제4본의 12개 장과 부록 A·B를 계승하며 2026-09-16·17 교정과 2026-10-09 후속 갱신을 반영한다. 본문의 9월 16일 시험 기록은 당시 기준판의 결과이며 최신 코드판과 검증 기록은 부록 D를 따른다. 구판의 규칙이나 시험 수치를 최신 구현의 사실로 옮기지 않는다.</w:t>
       </w:r>
     </w:p>
     <w:p>
@@ -1183,7 +1183,7 @@
     </w:p>
     <w:p>
       <w:r>
-        <w:t>쪽수는 이 개정판의 PDF 물리적 쪽수를 따른다. ‘현재 구현’은 부록 C에 고정한 코드판을 가리킨다. 이후 저장소의 main이 변경되면 해당 커밋 또는 후속 구현본을 함께 확인한다.</w:t>
+        <w:t>쪽수는 이 개정판의 PDF 물리적 쪽수를 따른다. ‘현재 구현’은 부록 D의 기준판을 가리킨다. §8.3·9와 부록 C의 2026-09-16 기록은 당시 기준판의 결과다. 이후 main이 변경되면 해당 커밋과 검증 기록을 함께 확인한다.</w:t>
       </w:r>
     </w:p>
     <w:p>
@@ -1430,7 +1430,7 @@
               <w:pStyle w:val="HMBRTable"/>
             </w:pPr>
             <w:r>
-              <w:t>문서 예시 우선 조회와 사전 원문 조회</w:t>
+              <w:t>문서 예시·강세 교정 자료·사전 원문 조회</w:t>
             </w:r>
           </w:p>
         </w:tc>
@@ -1526,6 +1526,37 @@
             </w:pPr>
             <w:r>
               <w:t>출처를 표시한 문서 예시</w:t>
+            </w:r>
+          </w:p>
+        </w:tc>
+      </w:tr>
+      <w:tr>
+        <w:trPr>
+          <w:cantSplit/>
+        </w:trPr>
+        <w:tc>
+          <w:tcPr>
+            <w:tcW w:type="dxa" w:w="4530"/>
+          </w:tcPr>
+          <w:p>
+            <w:pPr>
+              <w:pStyle w:val="HMBRTable"/>
+            </w:pPr>
+            <w:r>
+              <w:t>data/ipa-corrections.json</w:t>
+            </w:r>
+          </w:p>
+        </w:tc>
+        <w:tc>
+          <w:tcPr>
+            <w:tcW w:type="dxa" w:w="5108"/>
+          </w:tcPr>
+          <w:p>
+            <w:pPr>
+              <w:pStyle w:val="HMBRTable"/>
+            </w:pPr>
+            <w:r>
+              <w:t>일부 강세 교정 자료; 전체 발음 검수와 구분</w:t>
             </w:r>
           </w:p>
         </w:tc>
@@ -1680,7 +1711,7 @@
     </w:p>
     <w:p>
       <w:r>
-        <w:t>문서 예시와 일반 사전 조회는 화면의 출처 표지로 구별한다. ‘문서 예시’는 책에 수록된 참조 입력이라는 뜻이며, 전체 사전의 품질 보증이 아니다. 수업용 새 어휘는 실제 source IPA와 선택 모듈을 교사가 먼저 확인한다.</w:t>
+        <w:t>문서 예시·일부 강세 교정 자료·일반 사전 조회는 화면의 출처 표지로 구별한다. ‘문서 예시’는 책에 수록된 참조 입력이라는 뜻이며 전체 사전의 품질 보증이 아니다. 일부 강세 교정도 전체 IPA 검수 완료를 뜻하지 않는다. 수업용 새 어휘는 교사가 실제 source IPA와 선택 모듈을 먼저 확인한다.</w:t>
       </w:r>
     </w:p>
     <w:p>
@@ -1728,7 +1759,7 @@
     </w:p>
     <w:p>
       <w:r>
-        <w:t>처음에는 ‘책 속의 예시’에 있는 boost, play, friend, cats, about를 차례로 확인하는 편이 결과 구조를 익히기 쉽다. 영어 조회는 선택한 모듈의 문서 예시를 먼저 찾고, 없으면 첨부 사전을 읽는다. 일반 문장은 어휘별 결과의 배열이며 연결발화를 자동 재현한 결과가 아니다.</w:t>
+        <w:t>처음에는 ‘책 속의 예시’에 있는 boost, play, friend, cats, about를 차례로 확인하는 편이 결과 구조를 익히기 쉽다. 영어 조회는 선택한 모듈의 문서 예시, 일부 강세 교정 자료, 첨부 사전의 순서로 찾는다. 일반 문장은 어휘별 결과의 배열이며 연결발화를 자동 재현한 결과가 아니다.</w:t>
       </w:r>
     </w:p>
     <w:p>
@@ -2626,7 +2657,7 @@
     </w:p>
     <w:p>
       <w:r>
-        <w:t>현재 앱은 linear-trial-v8-vowel-carrier 표시 프로파일을 쓴다. 정본 NFD 부호열과 화면 렌더링을 분리하고, 각 블록의 자모 요소를 core·nucleus-tail·loose-consonant 역할로 나눠 배치한다.</w:t>
+        <w:t>현재 화면은 linear-trial-v8-vowel-carrier 표시 프로파일을 쓴다. 엔진 레코드의 display는 conjoining-jamo-v1이며 화면에서 요소별 역할과 크기를 계산한다. 화면용 core·nucleus-tail·loose-consonant 역할과 크기는 이 저장 필드에 추가하지 않는다.</w:t>
       </w:r>
     </w:p>
     <w:tbl>
@@ -2879,7 +2910,7 @@
               <w:pStyle w:val="HMBRTable"/>
             </w:pPr>
             <w:r>
-              <w:t>표시 프로파일, 블록별 요소, 역할(core·nucleus-tail·loose-consonant), 크기</w:t>
+              <w:t>엔진 표시 입력 프로파일, 블록별 onset·nucleus·coda, 강세·IPA</w:t>
             </w:r>
           </w:p>
         </w:tc>
@@ -2892,7 +2923,7 @@
               <w:pStyle w:val="HMBRTable"/>
             </w:pPr>
             <w:r>
-              <w:t>화면 배치와 대체 표시</w:t>
+              <w:t>화면 표시의 입력과 대체 정보</w:t>
             </w:r>
           </w:p>
         </w:tc>
@@ -3014,7 +3045,7 @@
     </w:p>
     <w:p>
       <w:r>
-        <w:t>RP·GA는 서로 다른 참조모듈이다. 영어 조회에서 모듈을 바꾸면 그 모듈의 예시 또는 사전 IPA를 다시 읽는다. 화면 자모만 바꾸는 기능이 아니다. 직접 입력에서는 사용자가 넣은 IPA가 선택한 모듈과 맞는지 확인한다.</w:t>
+        <w:t>RP·GA는 서로 다른 참조모듈이다. 영어 조회에서 모듈을 바꾸면 그 모듈의 문서 예시·강세 교정 자료 또는 사전 IPA를 다시 읽는다. 화면 자모만 바꾸는 기능이 아니다. 직접 입력에서는 사용자가 넣은 IPA가 선택한 모듈과 맞는지 확인한다.</w:t>
       </w:r>
     </w:p>
     <w:tbl>
@@ -4200,12 +4231,12 @@
         <w:pStyle w:val="Heading2"/>
       </w:pPr>
       <w:r>
-        <w:t>8.3 현재 확인 범위</w:t>
+        <w:t>8.3 2026-09-16 확인 범위</w:t>
       </w:r>
     </w:p>
     <w:p>
       <w:r>
-        <w:t>270개 자동시험은 /s/ 독립 표시, /t+s/와 /tʃ/ 구별, 뒤 모음 요소 50%, 독립 자음 75%, 정본 NFD 보존을 포함한다. 정적 검사와 배포 빌드도 통과했다.</w:t>
+        <w:t>당시 270개 자동시험은 /s/ 독립 표시, /t+s/와 /tʃ/ 구별, 뒤 모음 요소 50%, 독립 자음 75%, 정본 NFD 보존을 포함한다. 정적 검사와 배포 빌드도 통과했다.</w:t>
       </w:r>
     </w:p>
     <w:p>
@@ -4243,12 +4274,12 @@
         <w:pStyle w:val="Heading2"/>
       </w:pPr>
       <w:r>
-        <w:t>9.1 이번 실행에서 확인한 결과</w:t>
+        <w:t>9.1 2026-09-16 실행에서 확인한 결과</w:t>
       </w:r>
     </w:p>
     <w:p>
       <w:r>
-        <w:t>2026-09-16 현재 저장소의 검사·시험·빌드를 다시 실행했다. 엔진·사전·표시 자동시험 270건이 모두 통과했다. 제3본 예시, 오류 처리, /s/와 /t+s/ 독립 표시, 크기 규칙과 NFD 보존을 포함하며, 정적 검사는 53개 로컬 링크·자산과 입력 표지를 확인한다.</w:t>
+        <w:t>2026-09-16 기준판의 검사·시험·빌드를 다시 실행했다. 엔진·사전·표시 자동시험 270건이 모두 통과했다. 제3본 예시, 오류 처리, /s/와 /t+s/ 독립 표시, 크기 규칙과 NFD 보존을 포함하며, 정적 검사는 53개 로컬 링크·자산과 입력 표지를 확인한다.</w:t>
       </w:r>
     </w:p>
     <w:tbl>
@@ -4314,7 +4345,7 @@
                 <w:b/>
                 <w:color w:val="FFFFFF"/>
               </w:rPr>
-              <w:t>이번 결과</w:t>
+              <w:t>당시 결과</w:t>
             </w:r>
           </w:p>
         </w:tc>
@@ -4379,7 +4410,7 @@
               <w:pStyle w:val="HMBRTable"/>
             </w:pPr>
             <w:r>
-              <w:t>현재 수록 시험 조건의 통과</w:t>
+              <w:t>당시 수록 시험 조건의 통과</w:t>
             </w:r>
           </w:p>
         </w:tc>
@@ -4679,7 +4710,7 @@
     </w:p>
     <w:p>
       <w:r>
-        <w:t>구판 제4본의 70/70·183/183·515,370회와 원 앱 보고의 115건은 서로 다른 판본·범위의 수치다. 현재의 270건에 합산하지 않는다. 사전 군집 집계 재현과 전체 발음 정확도 평가는 자동시험 통과와도 구분한다.</w:t>
+        <w:t>구판 제4본의 70/70·183/183·515,370회와 원 앱 보고의 115건은 서로 다른 판본·범위의 수치다. 당시의 270건에 합산하지 않는다. 사전 군집 집계 재현과 전체 발음 정확도 평가는 자동시험 통과와도 구분한다.</w:t>
       </w:r>
     </w:p>
     <w:p>
@@ -4869,7 +4900,7 @@
     </w:p>
     <w:p>
       <w:r>
-        <w:t>빌드 성공과 원격 공개는 구분한다. 이번 판은 GitHub Actions 35074663177의 deploy 성공과 공개 URL을 확인했다. 이후 변경에서도 실제 workflow 결과와 서비스 주소를 다시 확인하고 §11에 기록한다.</w:t>
+        <w:t>빌드 성공과 원격 공개는 구분한다. 2026-09-16 판은 GitHub Actions 35074663177의 deploy 성공과 공개 URL을 확인했다. 최신 기록은 부록 D를 참조한다. 이후 변경에서도 workflow 결과와 서비스 주소를 다시 확인한다.</w:t>
       </w:r>
     </w:p>
     <w:p>
@@ -5499,7 +5530,7 @@
         <w:pStyle w:val="Heading2"/>
       </w:pPr>
       <w:r>
-        <w:t>11.1 현재 공개 결과</w:t>
+        <w:t>11.1 표시 프로파일과 배포 기록</w:t>
       </w:r>
     </w:p>
     <w:p>
@@ -5513,7 +5544,7 @@
         <w:keepNext/>
       </w:pPr>
       <w:r>
-        <w:t>확인 코드판: f049e24da7c34614a2129946071c4094c5f0964</w:t>
+        <w:t>2026-09-16 확인 코드판: f049e24da7c34614a2129946071c4094c5f0964</w:t>
       </w:r>
     </w:p>
     <w:p>
@@ -5531,7 +5562,7 @@
     </w:p>
     <w:p>
       <w:r>
-        <w:t>GitHub Actions 실행 35074663177의 build와 deploy가 success로 완료됐다. 배포 성공은 자동시험·정적 빌드와 공개 URL을 확인한 것이며, 모든 플랫폼의 조판·접근성 적합성을 보증하지 않는다.</w:t>
+        <w:t>2026-09-16 확인한 GitHub Actions 실행 35074663177의 build와 deploy가 success로 완료됐다. 배포 성공은 자동시험·정적 빌드와 공개 URL을 확인한 것이며, 모든 플랫폼의 조판·접근성 적합성을 보증하지 않는다.</w:t>
       </w:r>
     </w:p>
     <w:p>
@@ -6086,7 +6117,7 @@
     </w:p>
     <w:p>
       <w:r>
-        <w:t>이 표는 이번 구현의 점검표다. ‘확인’은 아래 범위에서 확인했다는 뜻이며 제3본 전체 적합성 인증이 아니다. 미실시·미구현 항목을 전체 통과 수에 넣지 않는다.</w:t>
+        <w:t>이 표는 2026-09-16 구현의 점검표이며 후속 검증은 부록 D를 따른다. ‘확인’은 아래 범위에서 확인했다는 뜻이며 제3본 전체 적합성 인증이 아니다. 미실시·미구현 항목을 전체 통과 수에 넣지 않는다.</w:t>
       </w:r>
     </w:p>
     <w:tbl>
@@ -6812,7 +6843,7 @@
               <w:pStyle w:val="HMBRTable"/>
             </w:pPr>
             <w:r>
-              <w:t>부분 확인</w:t>
+              <w:t>코드 확인</w:t>
             </w:r>
           </w:p>
         </w:tc>
@@ -6825,7 +6856,7 @@
               <w:pStyle w:val="HMBRTable"/>
             </w:pPr>
             <w:r>
-              <w:t>라이브 핵심 예시와 코드 확인; 다중 환경 전수시험 아님</w:t>
+              <w:t>코드 확인; 환경별 복사·다운로드 완료 검증 필요</w:t>
             </w:r>
           </w:p>
         </w:tc>
@@ -6872,7 +6903,7 @@
               <w:pStyle w:val="HMBRTable"/>
             </w:pPr>
             <w:r>
-              <w:t>라이브 화면·키보드 표지 확인; 낭독기 전수시험 필요</w:t>
+              <w:t>데스크톱 화면·코드 표지 확인; 모바일·낭독기 검증 필요</w:t>
             </w:r>
           </w:p>
         </w:tc>
@@ -6890,7 +6921,7 @@
               <w:pStyle w:val="HMBRTable"/>
             </w:pPr>
             <w:r>
-              <w:t>전 사전 변환·음성 정확도</w:t>
+              <w:t>사전 군집 전수 집계</w:t>
             </w:r>
           </w:p>
         </w:tc>
@@ -8179,12 +8210,12 @@
     </w:p>
     <w:p>
       <w:r>
-        <w:t>제1본 36쪽, 제2본 59쪽, 제3본 46쪽, 제4본 23쪽의 페이지 구성과 교정 범위를 확인했다. 제1·2본의 최신 편집 원본은 확보되지 않아 9월 8일 PDF를 기준으로 패치를 재구성한다.</w:t>
+        <w:t>2026-09-16 교정 당시 제1본 36쪽, 제2본 59쪽, 제3본 46쪽, 제4본 23쪽의 페이지 구성과 교정 범위를 확인했다. 제1·2본의 최신 편집 원본은 확보되지 않아 9월 8일 PDF를 기준으로 패치를 재구성했다.</w:t>
       </w:r>
     </w:p>
     <w:p>
       <w:r>
-        <w:t>제3본의 사전 수치는 현재 저장소의 tools/cluster_census.mjs로 재현했다. 제4본은 현재 코드·시험·배포 상태를 반영한다. 문서 검토와 음성학적 타당성·교육 효과·법적 효력 검증은 서로 구분한다.</w:t>
+        <w:t>제3본의 사전 수치는 당시 저장소의 tools/cluster_census.mjs로 재현했다. 제4본은 당시 코드·시험·배포 상태를 반영했다. 문서 검토와 음성학적 타당성·교육 효과·법적 효력 검증은 서로 구분한다.</w:t>
       </w:r>
     </w:p>
     <w:p>
@@ -8202,12 +8233,12 @@
     </w:p>
     <w:p>
       <w:r>
-        <w:t>현재 저장소의 js/, data/, fonts/, tests/, tools/, docs/와 README를 확인했다. 앱 표시 규칙, 270개 자동시험, 사전 전수조사 도구, 빌드 및 문서 링크를 같은 코드판에서 대조했다.</w:t>
+        <w:t>2026-09-16 기준판의 js/, data/, fonts/, tests/, tools/, docs/와 README를 확인했다. 앱 표시 규칙, 270개 자동시험, 사전 전수조사 도구, 빌드 및 문서 링크를 같은 코드판에서 대조했다.</w:t>
       </w:r>
     </w:p>
     <w:p>
       <w:r>
-        <w:t>npm test는 270/270, npm run check와 npm run build는 통과했다. 라이브 Pages 배포와 문서 링크를 확인했다. 다만 모든 브라우저·모바일·화면낭독기·클립보드 조합을 전수 시험했다고 주장하지 않는다.</w:t>
+        <w:t>당시 npm test는 270/270, npm run check와 npm run build는 통과했다. 라이브 Pages 배포와 문서 링크를 확인했다. 다만 모든 브라우저·모바일·화면낭독기·클립보드 조합을 전수 시험했다고 주장하지 않는다.</w:t>
       </w:r>
     </w:p>
     <w:p>
@@ -8430,7 +8461,7 @@
               <w:pStyle w:val="HMBRTable"/>
             </w:pPr>
             <w:r>
-              <w:t>현재 main 커밋·시험·배포 실행으로 갱신</w:t>
+              <w:t>당시 main 커밋·시험·배포 실행으로 갱신</w:t>
             </w:r>
           </w:p>
         </w:tc>
@@ -8554,7 +8585,7 @@
     </w:p>
     <w:p>
       <w:r>
-        <w:t>제3본의 사전 전수조사는 저장소의 코드로 재현됐고 종성 소계의 1종 차이는 compound_ts로 설명됐다. 제4본은 자동시험 270/270, 빌드 성공, 원격 커밋과 Pages 실행을 현재 값으로 갱신했다.</w:t>
+        <w:t>제3본의 사전 전수조사는 저장소의 코드로 재현됐고 종성 소계의 1종 차이는 compound_ts로 설명됐다. 제4본은 자동시험 270/270, 빌드 성공, 원격 커밋과 Pages 실행을 당시 값으로 갱신했다.</w:t>
       </w:r>
     </w:p>
     <w:p>
@@ -8599,7 +8630,7 @@
     </w:p>
     <w:p>
       <w:r>
-        <w:t xml:space="preserve">제1본은 2026-09-16, 제2본은 2026-09-17 판을 유지한다. 제3·4본은 2026-10-09 교정판이다. 제3본 37쪽의 표시 설명과 이 책 16쪽의 장모음 행을 바로잡았다. 뒤 모음의 50% 크기와 읽기용 무음 ㅇ 표시는 구현되어 있으며, 저장 V 배열과 정본 NFD에는 표시용 ㅇ을 더하지 않는다.</w:t>
+        <w:t>네 본을 2026-10-09 교정판으로 정리했다. 제3본 37쪽의 표시 설명과 이 책 16쪽의 장모음 행을 바로잡고 전권의 문언·참조·판본 설명을 교정했다. 제4본의 조회 순서와 저장 display 필드를 실제 코드에 맞췄다. 뒤 모음의 50% 크기와 읽기용 무음 ㅇ 표시는 구현되어 있으며 저장 V 배열과 정본 NFD에는 표시용 ㅇ을 더하지 않는다.</w:t>
       </w:r>
     </w:p>
     <w:p>
@@ -8612,7 +8643,7 @@
     </w:p>
     <w:p>
       <w:r>
-        <w:t xml:space="preserve">공개 앱 기준판은 9f750e2a5b467e435a71a516b87dbf24b0dfedb1이다. 2026-10-09 자동시험 283/283, 로컬 링크·자산 70개 검사와 정적 빌드가 통과했다. GitHub Actions 37870009195의 배포도 성공했다. 본문의 270건·53개 링크·f049e24·실행 35074663177은 9월 16일 당시 기록이다.</w:t>
+        <w:t>2026-10-09 앞선 앱 검증의 기준판은 9f750e2이며 자동시험 283/283, 로컬 링크·자산 70개 검사와 정적 빌드가 통과했다. Actions 37870009195의 배포도 성공했다. 이번 전권 교정의 코드 대조 기준판은 592fe8c이다. 본문의 270건·53개 링크·f049e24·실행 35074663177은 9월 16일 당시 기록이다.</w:t>
       </w:r>
     </w:p>
     <w:p>

</xml_diff>